<commit_message>
Write mathematical symbols in Cambria Math in the Word documents
Calibri and Courier New have no glyph for symbols such as the join (⋈),
the quantifiers and set membership, so Word could show them as empty
boxes (e.g. PT1 questions 4-6). All docx builders now put these
characters in Cambria Math; the documents were rebuilt.

Co-Authored-By: Claude Opus 5.5 <noreply@anthropic.com>
Claude-Session: https://claude.ai/code/session_0157NQpBHkydaVuWPpDtVnkB
</commit_message>
<xml_diff>
--- a/materials/labs/out/IDB201_Lab2.docx
+++ b/materials/labs/out/IDB201_Lab2.docx
@@ -1327,7 +1327,16 @@
               <w:spacing w:after="40"/>
             </w:pPr>
             <w:r>
-              <w:t xml:space="preserve">Missing or wrong constraints: −0.25 each</w:t>
+              <w:t xml:space="preserve">Missing or wrong constraints: </w:t>
+            </w:r>
+            <w:r>
+              <w:rPr>
+                <w:rFonts w:ascii="Cambria Math" w:cs="Cambria Math" w:eastAsia="Cambria Math" w:hAnsi="Cambria Math"/>
+              </w:rPr>
+              <w:t xml:space="preserve">−</w:t>
+            </w:r>
+            <w:r>
+              <w:t xml:space="preserve">0.25 each</w:t>
             </w:r>
           </w:p>
         </w:tc>
@@ -2496,7 +2505,43 @@
         <w:spacing w:after="60"/>
       </w:pPr>
       <w:r>
-        <w:t xml:space="preserve">A2: duplicate (S0001, 1) → error 2627 (primary key); student S9999 → 547 (foreign key); role 'treasurer' → 547 (check); duplicate club name → 2627 (unique key); membership without </w:t>
+        <w:t xml:space="preserve">A2: duplicate (S0001, 1) </w:t>
+      </w:r>
+      <w:r>
+        <w:rPr>
+          <w:rFonts w:ascii="Cambria Math" w:cs="Cambria Math" w:eastAsia="Cambria Math" w:hAnsi="Cambria Math"/>
+        </w:rPr>
+        <w:t xml:space="preserve">→</w:t>
+      </w:r>
+      <w:r>
+        <w:t xml:space="preserve"> error 2627 (primary key); student S9999 </w:t>
+      </w:r>
+      <w:r>
+        <w:rPr>
+          <w:rFonts w:ascii="Cambria Math" w:cs="Cambria Math" w:eastAsia="Cambria Math" w:hAnsi="Cambria Math"/>
+        </w:rPr>
+        <w:t xml:space="preserve">→</w:t>
+      </w:r>
+      <w:r>
+        <w:t xml:space="preserve"> 547 (foreign key); role 'treasurer' </w:t>
+      </w:r>
+      <w:r>
+        <w:rPr>
+          <w:rFonts w:ascii="Cambria Math" w:cs="Cambria Math" w:eastAsia="Cambria Math" w:hAnsi="Cambria Math"/>
+        </w:rPr>
+        <w:t xml:space="preserve">→</w:t>
+      </w:r>
+      <w:r>
+        <w:t xml:space="preserve"> 547 (check); duplicate club name </w:t>
+      </w:r>
+      <w:r>
+        <w:rPr>
+          <w:rFonts w:ascii="Cambria Math" w:cs="Cambria Math" w:eastAsia="Cambria Math" w:hAnsi="Cambria Math"/>
+        </w:rPr>
+        <w:t xml:space="preserve">→</w:t>
+      </w:r>
+      <w:r>
+        <w:t xml:space="preserve"> 2627 (unique key); membership without </w:t>
       </w:r>
       <w:r>
         <w:rPr>
@@ -2507,7 +2552,16 @@
         <w:t xml:space="preserve">joined</w:t>
       </w:r>
       <w:r>
-        <w:t xml:space="preserve"> → 515.</w:t>
+        <w:t xml:space="preserve"> </w:t>
+      </w:r>
+      <w:r>
+        <w:rPr>
+          <w:rFonts w:ascii="Cambria Math" w:cs="Cambria Math" w:eastAsia="Cambria Math" w:hAnsi="Cambria Math"/>
+        </w:rPr>
+        <w:t xml:space="preserve">→</w:t>
+      </w:r>
+      <w:r>
+        <w:t xml:space="preserve"> 515.</w:t>
       </w:r>
     </w:p>
     <w:p>

</xml_diff>